<commit_message>
Update Object Detection Model Rapport Tom.docx
</commit_message>
<xml_diff>
--- a/Documentatie/Verslagen/Object Detection Model Rapport Tom.docx
+++ b/Documentatie/Verslagen/Object Detection Model Rapport Tom.docx
@@ -899,7 +899,7 @@
           <w:r>
             <w:fldChar w:fldCharType="separate"/>
           </w:r>
-          <w:hyperlink w:anchor="_Toc224569327" w:history="1">
+          <w:hyperlink w:anchor="_Toc225424016" w:history="1">
             <w:r>
               <w:rPr>
                 <w:rStyle w:val="Hyperlink"/>
@@ -926,7 +926,7 @@
                 <w:noProof/>
                 <w:webHidden/>
               </w:rPr>
-              <w:instrText xml:space="preserve"> PAGEREF _Toc224569327 \h </w:instrText>
+              <w:instrText xml:space="preserve"> PAGEREF _Toc225424016 \h </w:instrText>
             </w:r>
             <w:r>
               <w:rPr>
@@ -971,7 +971,7 @@
               <w:lang w:val="nl-NL" w:eastAsia="ko-KR"/>
             </w:rPr>
           </w:pPr>
-          <w:hyperlink w:anchor="_Toc224569328" w:history="1">
+          <w:hyperlink w:anchor="_Toc225424017" w:history="1">
             <w:r>
               <w:rPr>
                 <w:rStyle w:val="Hyperlink"/>
@@ -998,7 +998,7 @@
                 <w:noProof/>
                 <w:webHidden/>
               </w:rPr>
-              <w:instrText xml:space="preserve"> PAGEREF _Toc224569328 \h </w:instrText>
+              <w:instrText xml:space="preserve"> PAGEREF _Toc225424017 \h </w:instrText>
             </w:r>
             <w:r>
               <w:rPr>
@@ -1043,7 +1043,7 @@
               <w:lang w:val="nl-NL" w:eastAsia="ko-KR"/>
             </w:rPr>
           </w:pPr>
-          <w:hyperlink w:anchor="_Toc224569329" w:history="1">
+          <w:hyperlink w:anchor="_Toc225424018" w:history="1">
             <w:r>
               <w:rPr>
                 <w:rStyle w:val="Hyperlink"/>
@@ -1070,7 +1070,7 @@
                 <w:noProof/>
                 <w:webHidden/>
               </w:rPr>
-              <w:instrText xml:space="preserve"> PAGEREF _Toc224569329 \h </w:instrText>
+              <w:instrText xml:space="preserve"> PAGEREF _Toc225424018 \h </w:instrText>
             </w:r>
             <w:r>
               <w:rPr>
@@ -1115,7 +1115,7 @@
               <w:lang w:val="nl-NL" w:eastAsia="ko-KR"/>
             </w:rPr>
           </w:pPr>
-          <w:hyperlink w:anchor="_Toc224569330" w:history="1">
+          <w:hyperlink w:anchor="_Toc225424019" w:history="1">
             <w:r>
               <w:rPr>
                 <w:rStyle w:val="Hyperlink"/>
@@ -1142,7 +1142,7 @@
                 <w:noProof/>
                 <w:webHidden/>
               </w:rPr>
-              <w:instrText xml:space="preserve"> PAGEREF _Toc224569330 \h </w:instrText>
+              <w:instrText xml:space="preserve"> PAGEREF _Toc225424019 \h </w:instrText>
             </w:r>
             <w:r>
               <w:rPr>
@@ -1187,7 +1187,7 @@
               <w:lang w:val="nl-NL" w:eastAsia="ko-KR"/>
             </w:rPr>
           </w:pPr>
-          <w:hyperlink w:anchor="_Toc224569331" w:history="1">
+          <w:hyperlink w:anchor="_Toc225424020" w:history="1">
             <w:r>
               <w:rPr>
                 <w:rStyle w:val="Hyperlink"/>
@@ -1214,7 +1214,7 @@
                 <w:noProof/>
                 <w:webHidden/>
               </w:rPr>
-              <w:instrText xml:space="preserve"> PAGEREF _Toc224569331 \h </w:instrText>
+              <w:instrText xml:space="preserve"> PAGEREF _Toc225424020 \h </w:instrText>
             </w:r>
             <w:r>
               <w:rPr>
@@ -1259,7 +1259,7 @@
               <w:lang w:val="nl-NL" w:eastAsia="ko-KR"/>
             </w:rPr>
           </w:pPr>
-          <w:hyperlink w:anchor="_Toc224569332" w:history="1">
+          <w:hyperlink w:anchor="_Toc225424021" w:history="1">
             <w:r>
               <w:rPr>
                 <w:rStyle w:val="Hyperlink"/>
@@ -1286,7 +1286,7 @@
                 <w:noProof/>
                 <w:webHidden/>
               </w:rPr>
-              <w:instrText xml:space="preserve"> PAGEREF _Toc224569332 \h </w:instrText>
+              <w:instrText xml:space="preserve"> PAGEREF _Toc225424021 \h </w:instrText>
             </w:r>
             <w:r>
               <w:rPr>
@@ -1331,7 +1331,7 @@
               <w:lang w:val="nl-NL" w:eastAsia="ko-KR"/>
             </w:rPr>
           </w:pPr>
-          <w:hyperlink w:anchor="_Toc224569333" w:history="1">
+          <w:hyperlink w:anchor="_Toc225424022" w:history="1">
             <w:r>
               <w:rPr>
                 <w:rStyle w:val="Hyperlink"/>
@@ -1359,7 +1359,7 @@
                 <w:noProof/>
                 <w:webHidden/>
               </w:rPr>
-              <w:instrText xml:space="preserve"> PAGEREF _Toc224569333 \h </w:instrText>
+              <w:instrText xml:space="preserve"> PAGEREF _Toc225424022 \h </w:instrText>
             </w:r>
             <w:r>
               <w:rPr>
@@ -1404,7 +1404,7 @@
               <w:lang w:val="nl-NL" w:eastAsia="ko-KR"/>
             </w:rPr>
           </w:pPr>
-          <w:hyperlink w:anchor="_Toc224569334" w:history="1">
+          <w:hyperlink w:anchor="_Toc225424023" w:history="1">
             <w:r>
               <w:rPr>
                 <w:rStyle w:val="Hyperlink"/>
@@ -1431,7 +1431,7 @@
                 <w:noProof/>
                 <w:webHidden/>
               </w:rPr>
-              <w:instrText xml:space="preserve"> PAGEREF _Toc224569334 \h </w:instrText>
+              <w:instrText xml:space="preserve"> PAGEREF _Toc225424023 \h </w:instrText>
             </w:r>
             <w:r>
               <w:rPr>
@@ -1495,7 +1495,7 @@
       <w:pPr>
         <w:pStyle w:val="Kop2"/>
       </w:pPr>
-      <w:bookmarkStart w:id="1" w:name="_Toc224569327"/>
+      <w:bookmarkStart w:id="1" w:name="_Toc225424016"/>
       <w:r>
         <w:lastRenderedPageBreak/>
         <w:t>Summary</w:t>
@@ -1514,7 +1514,21 @@
           <w:sz w:val="24"/>
           <w:szCs w:val="24"/>
         </w:rPr>
-        <w:t xml:space="preserve">// TO-DO </w:t>
+        <w:t xml:space="preserve">The outcome of this research is that </w:t>
+      </w:r>
+      <w:r>
+        <w:rPr>
+          <w:sz w:val="24"/>
+          <w:szCs w:val="24"/>
+        </w:rPr>
+        <w:t xml:space="preserve">there will be a YOLO-based model used, based on the fact that YOLO models have the best latency and accuracy trade-offs, relatively </w:t>
+      </w:r>
+      <w:r>
+        <w:rPr>
+          <w:sz w:val="24"/>
+          <w:szCs w:val="24"/>
+        </w:rPr>
+        <w:t>medium computational load on the system, and simple trainability compared to the SSD and Faster R-CNN models.</w:t>
       </w:r>
     </w:p>
     <w:p>
@@ -1529,7 +1543,7 @@
       <w:pPr>
         <w:pStyle w:val="Kop2"/>
       </w:pPr>
-      <w:bookmarkStart w:id="2" w:name="_Toc224569328"/>
+      <w:bookmarkStart w:id="2" w:name="_Toc225424017"/>
       <w:r>
         <w:t>In</w:t>
       </w:r>
@@ -1810,7 +1824,7 @@
       <w:pPr>
         <w:pStyle w:val="Kop2"/>
       </w:pPr>
-      <w:bookmarkStart w:id="3" w:name="_Toc224569329"/>
+      <w:bookmarkStart w:id="3" w:name="_Toc225424018"/>
       <w:r>
         <w:t>Method</w:t>
       </w:r>
@@ -2265,7 +2279,7 @@
       <w:pPr>
         <w:pStyle w:val="Kop2"/>
       </w:pPr>
-      <w:bookmarkStart w:id="4" w:name="_Toc224569330"/>
+      <w:bookmarkStart w:id="4" w:name="_Toc225424019"/>
       <w:r>
         <w:lastRenderedPageBreak/>
         <w:t>Results</w:t>
@@ -3001,7 +3015,7 @@
       <w:pPr>
         <w:pStyle w:val="Kop2"/>
       </w:pPr>
-      <w:bookmarkStart w:id="5" w:name="_Toc224569331"/>
+      <w:bookmarkStart w:id="5" w:name="_Toc225424020"/>
       <w:r>
         <w:t>Conclusi</w:t>
       </w:r>
@@ -3236,7 +3250,7 @@
       <w:pPr>
         <w:pStyle w:val="Kop2"/>
       </w:pPr>
-      <w:bookmarkStart w:id="6" w:name="_Toc224569332"/>
+      <w:bookmarkStart w:id="6" w:name="_Toc225424021"/>
       <w:r>
         <w:lastRenderedPageBreak/>
         <w:t>Glossary</w:t>
@@ -3287,7 +3301,7 @@
           <w:lang w:val="nl-NL"/>
         </w:rPr>
       </w:pPr>
-      <w:bookmarkStart w:id="7" w:name="_Toc224569333"/>
+      <w:bookmarkStart w:id="7" w:name="_Toc225424022"/>
       <w:r>
         <w:rPr>
           <w:lang w:val="nl-NL"/>
@@ -3750,7 +3764,7 @@
       <w:pPr>
         <w:pStyle w:val="Kop2"/>
       </w:pPr>
-      <w:bookmarkStart w:id="8" w:name="_Toc224569334"/>
+      <w:bookmarkStart w:id="8" w:name="_Toc225424023"/>
       <w:r>
         <w:t>Changelog</w:t>
       </w:r>

</xml_diff>